<commit_message>
docs: record DEF-010 and DEF-011 in the QA test report
The owner reported two more defects while reviewing PR #10: no gap above the Reading Summary panel, and a card count that read '3s cards of insight'. Both are fixed on the separate branch fix/qa-reading-summary-gap (PR #11).

The report now covers all 13 findings across both passes, the 35 test cases run, and the merge compatibility between the two branches.
</commit_message>
<xml_diff>
--- a/docs/Velora_Tarot_Test_Report.docx
+++ b/docs/Velora_Tarot_Test_Report.docx
@@ -57,7 +57,7 @@
           <w:color w:val="1A1A1A"/>
           <w:sz w:val="20"/>
         </w:rPr>
-        <w:t>This pass therefore began by re-auditing the deployed build to establish what was genuinely still broken, rather than assuming the old defect list still applied. Four of the original findings were still live. Re-auditing also surfaced two new defects that the original pass had not covered.</w:t>
+        <w:t>This pass therefore began by re-auditing the deployed build to establish what was genuinely still broken, rather than assuming the old defect list still applied. Four of the original findings were still live. Re-auditing also surfaced two further defects the original pass had not covered, and the owner reported two more while reviewing the resulting pull request.</w:t>
       </w:r>
     </w:p>
     <w:p>
@@ -67,7 +67,7 @@
           <w:color w:val="1A1A1A"/>
           <w:sz w:val="20"/>
         </w:rPr>
-        <w:t>All six outstanding defects are now fixed on branch fix/qa-remaining-defects-004-007 and verified. There are no open defects.</w:t>
+        <w:t>All eight outstanding defects are now fixed and verified across two branches: fix/qa-remaining-defects-004-007 (pull request #10) and fix/qa-reading-summary-gap (pull request #11). There are no open defects.</w:t>
       </w:r>
     </w:p>
     <w:p>
@@ -163,7 +163,7 @@
                 <w:color w:val="1A1A1A"/>
                 <w:sz w:val="17"/>
               </w:rPr>
-              <w:t>11</w:t>
+              <w:t>13</w:t>
             </w:r>
           </w:p>
         </w:tc>
@@ -239,7 +239,7 @@
                 <w:color w:val="1A1A1A"/>
                 <w:sz w:val="17"/>
               </w:rPr>
-              <w:t>6</w:t>
+              <w:t>8 (6 in PR #10, 2 in PR #11)</w:t>
             </w:r>
           </w:p>
         </w:tc>
@@ -528,7 +528,7 @@
                 <w:color w:val="1A1A1A"/>
                 <w:sz w:val="17"/>
               </w:rPr>
-              <w:t>Branch under test</w:t>
+              <w:t>Branch under test (PR #10)</w:t>
             </w:r>
           </w:p>
         </w:tc>
@@ -546,7 +546,7 @@
                 <w:color w:val="1A1A1A"/>
                 <w:sz w:val="17"/>
               </w:rPr>
-              <w:t>fix/qa-remaining-defects-004-007</w:t>
+              <w:t>fix/qa-remaining-defects-004-007 @ 6c1b646 — six accessibility defects</w:t>
             </w:r>
           </w:p>
         </w:tc>
@@ -566,7 +566,7 @@
                 <w:color w:val="1A1A1A"/>
                 <w:sz w:val="17"/>
               </w:rPr>
-              <w:t>Commit under test</w:t>
+              <w:t>Branch under test (PR #11)</w:t>
             </w:r>
           </w:p>
         </w:tc>
@@ -584,7 +584,45 @@
                 <w:color w:val="1A1A1A"/>
                 <w:sz w:val="17"/>
               </w:rPr>
-              <w:t>990377b — fix(a11y): close six accessibility defects still open on master</w:t>
+              <w:t>fix/qa-reading-summary-gap @ c44e1a0 — summary gap and card count</w:t>
+            </w:r>
+          </w:p>
+        </w:tc>
+      </w:tr>
+      <w:tr>
+        <w:tc>
+          <w:tcPr>
+            <w:tcW w:type="dxa" w:w="2736"/>
+          </w:tcPr>
+          <w:p>
+            <w:pPr>
+              <w:spacing w:after="40"/>
+            </w:pPr>
+            <w:r/>
+            <w:r>
+              <w:rPr>
+                <w:color w:val="1A1A1A"/>
+                <w:sz w:val="17"/>
+              </w:rPr>
+              <w:t>Merge compatibility</w:t>
+            </w:r>
+          </w:p>
+        </w:tc>
+        <w:tc>
+          <w:tcPr>
+            <w:tcW w:type="dxa" w:w="6480"/>
+          </w:tcPr>
+          <w:p>
+            <w:pPr>
+              <w:spacing w:after="40"/>
+            </w:pPr>
+            <w:r/>
+            <w:r>
+              <w:rPr>
+                <w:color w:val="1A1A1A"/>
+                <w:sz w:val="17"/>
+              </w:rPr>
+              <w:t>git merge-tree reports no conflicts between the two branches</w:t>
             </w:r>
           </w:p>
         </w:tc>
@@ -1198,7 +1236,7 @@
         <w:rPr>
           <w:sz w:val="20"/>
         </w:rPr>
-        <w:t>Two new defects were found while re-auditing and are recorded here for the first time.</w:t>
+        <w:t>Four new defects were found in total — two while re-auditing, and two reported by the owner while reviewing the first resulting pull request. All are recorded here for the first time.</w:t>
       </w:r>
     </w:p>
     <w:p>
@@ -1224,7 +1262,7 @@
           <w:color w:val="5A5A5A"/>
           <w:sz w:val="18"/>
         </w:rPr>
-        <w:t>Table 4 — All findings across both passes. Open: 0.</w:t>
+        <w:t>Table 4 — All 13 findings across both passes. Open: 0.</w:t>
       </w:r>
     </w:p>
     <w:tbl>
@@ -2116,6 +2154,190 @@
                 <w:sz w:val="17"/>
               </w:rPr>
               <w:t>Saved readings unreachable by keyboard (new)</w:t>
+            </w:r>
+          </w:p>
+        </w:tc>
+        <w:tc>
+          <w:tcPr>
+            <w:tcW w:type="dxa" w:w="1080"/>
+          </w:tcPr>
+          <w:p>
+            <w:pPr>
+              <w:spacing w:after="40"/>
+            </w:pPr>
+            <w:r/>
+            <w:r>
+              <w:rPr>
+                <w:color w:val="1A1A1A"/>
+                <w:sz w:val="17"/>
+              </w:rPr>
+              <w:t>Fixed</w:t>
+            </w:r>
+          </w:p>
+        </w:tc>
+        <w:tc>
+          <w:tcPr>
+            <w:tcW w:type="dxa" w:w="1656"/>
+          </w:tcPr>
+          <w:p>
+            <w:pPr>
+              <w:spacing w:after="40"/>
+            </w:pPr>
+            <w:r/>
+            <w:r>
+              <w:rPr>
+                <w:color w:val="1A1A1A"/>
+                <w:sz w:val="17"/>
+              </w:rPr>
+              <w:t>This pass</w:t>
+            </w:r>
+          </w:p>
+        </w:tc>
+      </w:tr>
+      <w:tr>
+        <w:tc>
+          <w:tcPr>
+            <w:tcW w:type="dxa" w:w="936"/>
+          </w:tcPr>
+          <w:p>
+            <w:pPr>
+              <w:spacing w:after="40"/>
+            </w:pPr>
+            <w:r/>
+            <w:r>
+              <w:rPr>
+                <w:color w:val="1A1A1A"/>
+                <w:sz w:val="17"/>
+              </w:rPr>
+              <w:t>DEF-010</w:t>
+            </w:r>
+          </w:p>
+        </w:tc>
+        <w:tc>
+          <w:tcPr>
+            <w:tcW w:type="dxa" w:w="1152"/>
+          </w:tcPr>
+          <w:p>
+            <w:pPr>
+              <w:spacing w:after="40"/>
+            </w:pPr>
+            <w:r/>
+            <w:r>
+              <w:rPr>
+                <w:color w:val="1A1A1A"/>
+                <w:sz w:val="17"/>
+              </w:rPr>
+              <w:t>LOW</w:t>
+            </w:r>
+          </w:p>
+        </w:tc>
+        <w:tc>
+          <w:tcPr>
+            <w:tcW w:type="dxa" w:w="4392"/>
+          </w:tcPr>
+          <w:p>
+            <w:pPr>
+              <w:spacing w:after="40"/>
+            </w:pPr>
+            <w:r/>
+            <w:r>
+              <w:rPr>
+                <w:color w:val="1A1A1A"/>
+                <w:sz w:val="17"/>
+              </w:rPr>
+              <w:t>No gap above the Reading Summary panel (new)</w:t>
+            </w:r>
+          </w:p>
+        </w:tc>
+        <w:tc>
+          <w:tcPr>
+            <w:tcW w:type="dxa" w:w="1080"/>
+          </w:tcPr>
+          <w:p>
+            <w:pPr>
+              <w:spacing w:after="40"/>
+            </w:pPr>
+            <w:r/>
+            <w:r>
+              <w:rPr>
+                <w:color w:val="1A1A1A"/>
+                <w:sz w:val="17"/>
+              </w:rPr>
+              <w:t>Fixed</w:t>
+            </w:r>
+          </w:p>
+        </w:tc>
+        <w:tc>
+          <w:tcPr>
+            <w:tcW w:type="dxa" w:w="1656"/>
+          </w:tcPr>
+          <w:p>
+            <w:pPr>
+              <w:spacing w:after="40"/>
+            </w:pPr>
+            <w:r/>
+            <w:r>
+              <w:rPr>
+                <w:color w:val="1A1A1A"/>
+                <w:sz w:val="17"/>
+              </w:rPr>
+              <w:t>This pass</w:t>
+            </w:r>
+          </w:p>
+        </w:tc>
+      </w:tr>
+      <w:tr>
+        <w:tc>
+          <w:tcPr>
+            <w:tcW w:type="dxa" w:w="936"/>
+          </w:tcPr>
+          <w:p>
+            <w:pPr>
+              <w:spacing w:after="40"/>
+            </w:pPr>
+            <w:r/>
+            <w:r>
+              <w:rPr>
+                <w:color w:val="1A1A1A"/>
+                <w:sz w:val="17"/>
+              </w:rPr>
+              <w:t>DEF-011</w:t>
+            </w:r>
+          </w:p>
+        </w:tc>
+        <w:tc>
+          <w:tcPr>
+            <w:tcW w:type="dxa" w:w="1152"/>
+          </w:tcPr>
+          <w:p>
+            <w:pPr>
+              <w:spacing w:after="40"/>
+            </w:pPr>
+            <w:r/>
+            <w:r>
+              <w:rPr>
+                <w:color w:val="1A1A1A"/>
+                <w:sz w:val="17"/>
+              </w:rPr>
+              <w:t>LOW</w:t>
+            </w:r>
+          </w:p>
+        </w:tc>
+        <w:tc>
+          <w:tcPr>
+            <w:tcW w:type="dxa" w:w="4392"/>
+          </w:tcPr>
+          <w:p>
+            <w:pPr>
+              <w:spacing w:after="40"/>
+            </w:pPr>
+            <w:r/>
+            <w:r>
+              <w:rPr>
+                <w:color w:val="1A1A1A"/>
+                <w:sz w:val="17"/>
+              </w:rPr>
+              <w:t>Summary read '3s cards of insight' (new)</w:t>
             </w:r>
           </w:p>
         </w:tc>
@@ -4156,6 +4378,278 @@
     </w:p>
     <w:p>
       <w:pPr>
+        <w:spacing w:before="220" w:after="60"/>
+      </w:pPr>
+      <w:r>
+        <w:rPr>
+          <w:b/>
+          <w:color w:val="1A1A1A"/>
+          <w:sz w:val="22"/>
+        </w:rPr>
+        <w:t>DEF-010 — No gap above the Reading Summary panel (LOW, new)</w:t>
+      </w:r>
+    </w:p>
+    <w:p>
+      <w:r>
+        <w:rPr>
+          <w:i w:val="0"/>
+          <w:color w:val="1A1A1A"/>
+          <w:sz w:val="20"/>
+        </w:rPr>
+        <w:t>Symptom: reported by the owner. On a saved-reading page the last card interpretation block and the Reading Summary panel sat directly against each other with no spacing.</w:t>
+      </w:r>
+    </w:p>
+    <w:p>
+      <w:r>
+        <w:rPr>
+          <w:i/>
+          <w:color w:val="5A5A5A"/>
+          <w:sz w:val="20"/>
+        </w:rPr>
+        <w:t>Cause: the summary panel is a sibling of the grid that holds the card blocks, not one of its items. The grid's gap property spaces grid items from each other and stops at the last one, so it never applied to the panel that follows.</w:t>
+      </w:r>
+    </w:p>
+    <w:p>
+      <w:r>
+        <w:rPr>
+          <w:i w:val="0"/>
+          <w:color w:val="1A1A1A"/>
+          <w:sz w:val="20"/>
+        </w:rPr>
+        <w:t>Fix: mt-4 on the summary panel restores the same 16px the cards use between themselves. Verified by measurement rather than by eye: the gap between the last card block's bottom edge and the panel's top edge is 16px on both a three-card and a one-card reading.</w:t>
+      </w:r>
+    </w:p>
+    <w:p>
+      <w:pPr>
+        <w:spacing w:before="220" w:after="60"/>
+      </w:pPr>
+      <w:r>
+        <w:rPr>
+          <w:b/>
+          <w:color w:val="1A1A1A"/>
+          <w:sz w:val="22"/>
+        </w:rPr>
+        <w:t>DEF-011 — Summary read '3s cards of insight' (LOW, new)</w:t>
+      </w:r>
+    </w:p>
+    <w:p>
+      <w:r>
+        <w:rPr>
+          <w:i w:val="0"/>
+          <w:color w:val="1A1A1A"/>
+          <w:sz w:val="20"/>
+        </w:rPr>
+        <w:t>Symptom: reported by the owner. The summary sentence pluralised the card count as well as the noun, so a three-card reading read "reveals 3s cards of insight".</w:t>
+      </w:r>
+    </w:p>
+    <w:p>
+      <w:pPr>
+        <w:spacing w:before="160" w:after="60"/>
+      </w:pPr>
+      <w:r>
+        <w:rPr>
+          <w:b/>
+          <w:color w:val="5A5A5A"/>
+          <w:sz w:val="18"/>
+        </w:rPr>
+        <w:t>Table 9b — DEF-011 copy</w:t>
+      </w:r>
+    </w:p>
+    <w:tbl>
+      <w:tblPr>
+        <w:tblStyle w:val="TableGrid"/>
+        <w:tblW w:type="auto" w:w="0"/>
+        <w:jc w:val="center"/>
+        <w:tblLook w:firstColumn="1" w:firstRow="1" w:lastColumn="0" w:lastRow="0" w:noHBand="0" w:noVBand="1" w:val="04A0"/>
+      </w:tblPr>
+      <w:tblGrid>
+        <w:gridCol w:w="3216"/>
+        <w:gridCol w:w="3216"/>
+        <w:gridCol w:w="3216"/>
+      </w:tblGrid>
+      <w:tr>
+        <w:tc>
+          <w:tcPr>
+            <w:tcW w:type="dxa" w:w="1440"/>
+            <w:shd w:val="clear" w:color="auto" w:fill="4A4A4A"/>
+          </w:tcPr>
+          <w:p>
+            <w:r/>
+            <w:r>
+              <w:rPr>
+                <w:b/>
+                <w:color w:val="FFFFFF"/>
+                <w:sz w:val="17"/>
+              </w:rPr>
+              <w:t>Cards</w:t>
+            </w:r>
+          </w:p>
+        </w:tc>
+        <w:tc>
+          <w:tcPr>
+            <w:tcW w:type="dxa" w:w="3888"/>
+            <w:shd w:val="clear" w:color="auto" w:fill="4A4A4A"/>
+          </w:tcPr>
+          <w:p>
+            <w:r/>
+            <w:r>
+              <w:rPr>
+                <w:b/>
+                <w:color w:val="FFFFFF"/>
+                <w:sz w:val="17"/>
+              </w:rPr>
+              <w:t>Before</w:t>
+            </w:r>
+          </w:p>
+        </w:tc>
+        <w:tc>
+          <w:tcPr>
+            <w:tcW w:type="dxa" w:w="3888"/>
+            <w:shd w:val="clear" w:color="auto" w:fill="4A4A4A"/>
+          </w:tcPr>
+          <w:p>
+            <w:r/>
+            <w:r>
+              <w:rPr>
+                <w:b/>
+                <w:color w:val="FFFFFF"/>
+                <w:sz w:val="17"/>
+              </w:rPr>
+              <w:t>After</w:t>
+            </w:r>
+          </w:p>
+        </w:tc>
+      </w:tr>
+      <w:tr>
+        <w:tc>
+          <w:tcPr>
+            <w:tcW w:type="dxa" w:w="1440"/>
+          </w:tcPr>
+          <w:p>
+            <w:pPr>
+              <w:spacing w:after="40"/>
+            </w:pPr>
+            <w:r/>
+            <w:r>
+              <w:rPr>
+                <w:color w:val="1A1A1A"/>
+                <w:sz w:val="17"/>
+              </w:rPr>
+              <w:t>3</w:t>
+            </w:r>
+          </w:p>
+        </w:tc>
+        <w:tc>
+          <w:tcPr>
+            <w:tcW w:type="dxa" w:w="3888"/>
+          </w:tcPr>
+          <w:p>
+            <w:pPr>
+              <w:spacing w:after="40"/>
+            </w:pPr>
+            <w:r/>
+            <w:r>
+              <w:rPr>
+                <w:color w:val="1A1A1A"/>
+                <w:sz w:val="17"/>
+              </w:rPr>
+              <w:t>reveals 3s cards of insight</w:t>
+            </w:r>
+          </w:p>
+        </w:tc>
+        <w:tc>
+          <w:tcPr>
+            <w:tcW w:type="dxa" w:w="3888"/>
+          </w:tcPr>
+          <w:p>
+            <w:pPr>
+              <w:spacing w:after="40"/>
+            </w:pPr>
+            <w:r/>
+            <w:r>
+              <w:rPr>
+                <w:color w:val="1A1A1A"/>
+                <w:sz w:val="17"/>
+              </w:rPr>
+              <w:t>reveals 3 cards of insight</w:t>
+            </w:r>
+          </w:p>
+        </w:tc>
+      </w:tr>
+      <w:tr>
+        <w:tc>
+          <w:tcPr>
+            <w:tcW w:type="dxa" w:w="1440"/>
+          </w:tcPr>
+          <w:p>
+            <w:pPr>
+              <w:spacing w:after="40"/>
+            </w:pPr>
+            <w:r/>
+            <w:r>
+              <w:rPr>
+                <w:color w:val="1A1A1A"/>
+                <w:sz w:val="17"/>
+              </w:rPr>
+              <w:t>1</w:t>
+            </w:r>
+          </w:p>
+        </w:tc>
+        <w:tc>
+          <w:tcPr>
+            <w:tcW w:type="dxa" w:w="3888"/>
+          </w:tcPr>
+          <w:p>
+            <w:pPr>
+              <w:spacing w:after="40"/>
+            </w:pPr>
+            <w:r/>
+            <w:r>
+              <w:rPr>
+                <w:color w:val="1A1A1A"/>
+                <w:sz w:val="17"/>
+              </w:rPr>
+              <w:t>reveals 1 card of insight</w:t>
+            </w:r>
+          </w:p>
+        </w:tc>
+        <w:tc>
+          <w:tcPr>
+            <w:tcW w:type="dxa" w:w="3888"/>
+          </w:tcPr>
+          <w:p>
+            <w:pPr>
+              <w:spacing w:after="40"/>
+            </w:pPr>
+            <w:r/>
+            <w:r>
+              <w:rPr>
+                <w:color w:val="1A1A1A"/>
+                <w:sz w:val="17"/>
+              </w:rPr>
+              <w:t>unchanged, already correct</w:t>
+            </w:r>
+          </w:p>
+        </w:tc>
+      </w:tr>
+    </w:tbl>
+    <w:p>
+      <w:pPr>
+        <w:spacing w:after="40"/>
+      </w:pPr>
+    </w:p>
+    <w:p>
+      <w:r>
+        <w:rPr>
+          <w:i w:val="0"/>
+          <w:color w:val="1A1A1A"/>
+          <w:sz w:val="20"/>
+        </w:rPr>
+        <w:t>Fix: the stray pluralisation of the number is removed, leaving the noun's plural intact. Both branches of the conditional were verified against a live reading.</w:t>
+      </w:r>
+    </w:p>
+    <w:p>
+      <w:pPr>
         <w:spacing w:before="320" w:after="120"/>
       </w:pPr>
       <w:r>
@@ -4177,7 +4671,7 @@
           <w:color w:val="5A5A5A"/>
           <w:sz w:val="18"/>
         </w:rPr>
-        <w:t>Table 10 — Static and automated checks (branch 990377b)</w:t>
+        <w:t>Table 10 — Static and automated checks (PR #10 @ 6c1b646, PR #11 @ c44e1a0)</w:t>
       </w:r>
     </w:p>
     <w:tbl>
@@ -4577,6 +5071,118 @@
                 <w:sz w:val="17"/>
               </w:rPr>
               <w:t>0 on audited routes; homepage asserted by assets.spec.ts</w:t>
+            </w:r>
+          </w:p>
+        </w:tc>
+      </w:tr>
+      <w:tr>
+        <w:tc>
+          <w:tcPr>
+            <w:tcW w:type="dxa" w:w="2160"/>
+          </w:tcPr>
+          <w:p>
+            <w:pPr>
+              <w:spacing w:after="40"/>
+            </w:pPr>
+            <w:r/>
+            <w:r>
+              <w:rPr>
+                <w:color w:val="1A1A1A"/>
+                <w:sz w:val="17"/>
+              </w:rPr>
+              <w:t>Summary panel gap</w:t>
+            </w:r>
+          </w:p>
+        </w:tc>
+        <w:tc>
+          <w:tcPr>
+            <w:tcW w:type="dxa" w:w="2736"/>
+          </w:tcPr>
+          <w:p>
+            <w:pPr>
+              <w:spacing w:after="40"/>
+            </w:pPr>
+            <w:r/>
+            <w:r>
+              <w:rPr>
+                <w:color w:val="1A1A1A"/>
+                <w:sz w:val="17"/>
+              </w:rPr>
+              <w:t>Runtime measurement</w:t>
+            </w:r>
+          </w:p>
+        </w:tc>
+        <w:tc>
+          <w:tcPr>
+            <w:tcW w:type="dxa" w:w="4320"/>
+          </w:tcPr>
+          <w:p>
+            <w:pPr>
+              <w:spacing w:after="40"/>
+            </w:pPr>
+            <w:r/>
+            <w:r>
+              <w:rPr>
+                <w:color w:val="1A1A1A"/>
+                <w:sz w:val="17"/>
+              </w:rPr>
+              <w:t>16px on 3-card and 1-card readings (DEF-010)</w:t>
+            </w:r>
+          </w:p>
+        </w:tc>
+      </w:tr>
+      <w:tr>
+        <w:tc>
+          <w:tcPr>
+            <w:tcW w:type="dxa" w:w="2160"/>
+          </w:tcPr>
+          <w:p>
+            <w:pPr>
+              <w:spacing w:after="40"/>
+            </w:pPr>
+            <w:r/>
+            <w:r>
+              <w:rPr>
+                <w:color w:val="1A1A1A"/>
+                <w:sz w:val="17"/>
+              </w:rPr>
+              <w:t>Summary card count</w:t>
+            </w:r>
+          </w:p>
+        </w:tc>
+        <w:tc>
+          <w:tcPr>
+            <w:tcW w:type="dxa" w:w="2736"/>
+          </w:tcPr>
+          <w:p>
+            <w:pPr>
+              <w:spacing w:after="40"/>
+            </w:pPr>
+            <w:r/>
+            <w:r>
+              <w:rPr>
+                <w:color w:val="1A1A1A"/>
+                <w:sz w:val="17"/>
+              </w:rPr>
+              <w:t>Runtime measurement</w:t>
+            </w:r>
+          </w:p>
+        </w:tc>
+        <w:tc>
+          <w:tcPr>
+            <w:tcW w:type="dxa" w:w="4320"/>
+          </w:tcPr>
+          <w:p>
+            <w:pPr>
+              <w:spacing w:after="40"/>
+            </w:pPr>
+            <w:r/>
+            <w:r>
+              <w:rPr>
+                <w:color w:val="1A1A1A"/>
+                <w:sz w:val="17"/>
+              </w:rPr>
+              <w:t>'3 cards' and '1 card' both correct (DEF-011)</w:t>
             </w:r>
           </w:p>
         </w:tc>
@@ -5979,7 +6585,7 @@
           <w:color w:val="1A1A1A"/>
           <w:sz w:val="20"/>
         </w:rPr>
-        <w:t>32 cases, all passing on the branch under test.</w:t>
+        <w:t>35 cases, all passing on the branches under test.</w:t>
       </w:r>
     </w:p>
     <w:p>
@@ -8245,7 +8851,7 @@
                 <w:color w:val="1A1A1A"/>
                 <w:sz w:val="17"/>
               </w:rPr>
-              <w:t>Touch targets</w:t>
+              <w:t>Detail page</w:t>
             </w:r>
           </w:p>
         </w:tc>
@@ -8263,7 +8869,7 @@
                 <w:color w:val="1A1A1A"/>
                 <w:sz w:val="17"/>
               </w:rPr>
-              <w:t>Nav controls hit-test a 44x44 box</w:t>
+              <w:t>Gap between last card block and summary panel</w:t>
             </w:r>
           </w:p>
         </w:tc>
@@ -8281,7 +8887,7 @@
                 <w:color w:val="1A1A1A"/>
                 <w:sz w:val="17"/>
               </w:rPr>
-              <w:t>25/25 probes each</w:t>
+              <w:t>16px</w:t>
             </w:r>
           </w:p>
         </w:tc>
@@ -8337,7 +8943,7 @@
                 <w:color w:val="1A1A1A"/>
                 <w:sz w:val="17"/>
               </w:rPr>
-              <w:t>Touch targets</w:t>
+              <w:t>Detail page</w:t>
             </w:r>
           </w:p>
         </w:tc>
@@ -8355,7 +8961,7 @@
                 <w:color w:val="1A1A1A"/>
                 <w:sz w:val="17"/>
               </w:rPr>
-              <w:t>Mobile menu toggle hit area</w:t>
+              <w:t>Summary count on a 3-card reading</w:t>
             </w:r>
           </w:p>
         </w:tc>
@@ -8373,7 +8979,7 @@
                 <w:color w:val="1A1A1A"/>
                 <w:sz w:val="17"/>
               </w:rPr>
-              <w:t>44 x 44 via computed geometry</w:t>
+              <w:t>'reveals 3 cards'</w:t>
             </w:r>
           </w:p>
         </w:tc>
@@ -8429,7 +9035,7 @@
                 <w:color w:val="1A1A1A"/>
                 <w:sz w:val="17"/>
               </w:rPr>
-              <w:t>Touch targets</w:t>
+              <w:t>Detail page</w:t>
             </w:r>
           </w:p>
         </w:tc>
@@ -8447,7 +9053,7 @@
                 <w:color w:val="1A1A1A"/>
                 <w:sz w:val="17"/>
               </w:rPr>
-              <w:t>Mobile menu link hit area</w:t>
+              <w:t>Summary count on a 1-card reading</w:t>
             </w:r>
           </w:p>
         </w:tc>
@@ -8465,7 +9071,7 @@
                 <w:color w:val="1A1A1A"/>
                 <w:sz w:val="17"/>
               </w:rPr>
-              <w:t>44px tall via computed geometry</w:t>
+              <w:t>'reveals 1 card'</w:t>
             </w:r>
           </w:p>
         </w:tc>
@@ -8539,7 +9145,7 @@
                 <w:color w:val="1A1A1A"/>
                 <w:sz w:val="17"/>
               </w:rPr>
-              <w:t>No horizontal overflow at 320/360/375/390/412px</w:t>
+              <w:t>Nav controls hit-test a 44x44 box</w:t>
             </w:r>
           </w:p>
         </w:tc>
@@ -8557,7 +9163,7 @@
                 <w:color w:val="1A1A1A"/>
                 <w:sz w:val="17"/>
               </w:rPr>
-              <w:t>None</w:t>
+              <w:t>25/25 probes each</w:t>
             </w:r>
           </w:p>
         </w:tc>
@@ -8613,7 +9219,7 @@
                 <w:color w:val="1A1A1A"/>
                 <w:sz w:val="17"/>
               </w:rPr>
-              <w:t>History</w:t>
+              <w:t>Touch targets</w:t>
             </w:r>
           </w:p>
         </w:tc>
@@ -8631,7 +9237,7 @@
                 <w:color w:val="1A1A1A"/>
                 <w:sz w:val="17"/>
               </w:rPr>
-              <w:t>Saved readings are listed</w:t>
+              <w:t>Mobile menu toggle hit area</w:t>
             </w:r>
           </w:p>
         </w:tc>
@@ -8649,7 +9255,7 @@
                 <w:color w:val="1A1A1A"/>
                 <w:sz w:val="17"/>
               </w:rPr>
-              <w:t>Both readings rendered</w:t>
+              <w:t>44 x 44 via computed geometry</w:t>
             </w:r>
           </w:p>
         </w:tc>
@@ -8705,7 +9311,7 @@
                 <w:color w:val="1A1A1A"/>
                 <w:sz w:val="17"/>
               </w:rPr>
-              <w:t>History</w:t>
+              <w:t>Touch targets</w:t>
             </w:r>
           </w:p>
         </w:tc>
@@ -8723,7 +9329,7 @@
                 <w:color w:val="1A1A1A"/>
                 <w:sz w:val="17"/>
               </w:rPr>
-              <w:t>Entry semantics</w:t>
+              <w:t>Mobile menu link hit area</w:t>
             </w:r>
           </w:p>
         </w:tc>
@@ -8741,7 +9347,7 @@
                 <w:color w:val="1A1A1A"/>
                 <w:sz w:val="17"/>
               </w:rPr>
-              <w:t>role=link, focusable, labelled</w:t>
+              <w:t>44px tall via computed geometry</w:t>
             </w:r>
           </w:p>
         </w:tc>
@@ -8797,7 +9403,7 @@
                 <w:color w:val="1A1A1A"/>
                 <w:sz w:val="17"/>
               </w:rPr>
-              <w:t>History</w:t>
+              <w:t>Touch targets</w:t>
             </w:r>
           </w:p>
         </w:tc>
@@ -8815,7 +9421,7 @@
                 <w:color w:val="1A1A1A"/>
                 <w:sz w:val="17"/>
               </w:rPr>
-              <w:t>Activate an entry with Enter</w:t>
+              <w:t>No horizontal overflow at 320/360/375/390/412px</w:t>
             </w:r>
           </w:p>
         </w:tc>
@@ -8833,7 +9439,7 @@
                 <w:color w:val="1A1A1A"/>
                 <w:sz w:val="17"/>
               </w:rPr>
-              <w:t>Navigates to the reading</w:t>
+              <w:t>None</w:t>
             </w:r>
           </w:p>
         </w:tc>
@@ -8889,7 +9495,7 @@
                 <w:color w:val="1A1A1A"/>
                 <w:sz w:val="17"/>
               </w:rPr>
-              <w:t>Console and assets</w:t>
+              <w:t>History</w:t>
             </w:r>
           </w:p>
         </w:tc>
@@ -8907,7 +9513,7 @@
                 <w:color w:val="1A1A1A"/>
                 <w:sz w:val="17"/>
               </w:rPr>
-              <w:t>Console errors on audited routes</w:t>
+              <w:t>Saved readings are listed</w:t>
             </w:r>
           </w:p>
         </w:tc>
@@ -8925,7 +9531,7 @@
                 <w:color w:val="1A1A1A"/>
                 <w:sz w:val="17"/>
               </w:rPr>
-              <w:t>0</w:t>
+              <w:t>Both readings rendered</w:t>
             </w:r>
           </w:p>
         </w:tc>
@@ -8964,6 +9570,282 @@
                 <w:sz w:val="17"/>
               </w:rPr>
               <w:t>32</w:t>
+            </w:r>
+          </w:p>
+        </w:tc>
+        <w:tc>
+          <w:tcPr>
+            <w:tcW w:type="dxa" w:w="1944"/>
+          </w:tcPr>
+          <w:p>
+            <w:pPr>
+              <w:spacing w:after="40"/>
+            </w:pPr>
+            <w:r/>
+            <w:r>
+              <w:rPr>
+                <w:color w:val="1A1A1A"/>
+                <w:sz w:val="17"/>
+              </w:rPr>
+              <w:t>History</w:t>
+            </w:r>
+          </w:p>
+        </w:tc>
+        <w:tc>
+          <w:tcPr>
+            <w:tcW w:type="dxa" w:w="3456"/>
+          </w:tcPr>
+          <w:p>
+            <w:pPr>
+              <w:spacing w:after="40"/>
+            </w:pPr>
+            <w:r/>
+            <w:r>
+              <w:rPr>
+                <w:color w:val="1A1A1A"/>
+                <w:sz w:val="17"/>
+              </w:rPr>
+              <w:t>Entry semantics</w:t>
+            </w:r>
+          </w:p>
+        </w:tc>
+        <w:tc>
+          <w:tcPr>
+            <w:tcW w:type="dxa" w:w="2520"/>
+          </w:tcPr>
+          <w:p>
+            <w:pPr>
+              <w:spacing w:after="40"/>
+            </w:pPr>
+            <w:r/>
+            <w:r>
+              <w:rPr>
+                <w:color w:val="1A1A1A"/>
+                <w:sz w:val="17"/>
+              </w:rPr>
+              <w:t>role=link, focusable, labelled</w:t>
+            </w:r>
+          </w:p>
+        </w:tc>
+        <w:tc>
+          <w:tcPr>
+            <w:tcW w:type="dxa" w:w="792"/>
+          </w:tcPr>
+          <w:p>
+            <w:pPr>
+              <w:spacing w:after="40"/>
+            </w:pPr>
+            <w:r/>
+            <w:r>
+              <w:rPr>
+                <w:color w:val="1A1A1A"/>
+                <w:sz w:val="17"/>
+              </w:rPr>
+              <w:t>PASS</w:t>
+            </w:r>
+          </w:p>
+        </w:tc>
+      </w:tr>
+      <w:tr>
+        <w:tc>
+          <w:tcPr>
+            <w:tcW w:type="dxa" w:w="576"/>
+          </w:tcPr>
+          <w:p>
+            <w:pPr>
+              <w:spacing w:after="40"/>
+            </w:pPr>
+            <w:r/>
+            <w:r>
+              <w:rPr>
+                <w:color w:val="1A1A1A"/>
+                <w:sz w:val="17"/>
+              </w:rPr>
+              <w:t>33</w:t>
+            </w:r>
+          </w:p>
+        </w:tc>
+        <w:tc>
+          <w:tcPr>
+            <w:tcW w:type="dxa" w:w="1944"/>
+          </w:tcPr>
+          <w:p>
+            <w:pPr>
+              <w:spacing w:after="40"/>
+            </w:pPr>
+            <w:r/>
+            <w:r>
+              <w:rPr>
+                <w:color w:val="1A1A1A"/>
+                <w:sz w:val="17"/>
+              </w:rPr>
+              <w:t>History</w:t>
+            </w:r>
+          </w:p>
+        </w:tc>
+        <w:tc>
+          <w:tcPr>
+            <w:tcW w:type="dxa" w:w="3456"/>
+          </w:tcPr>
+          <w:p>
+            <w:pPr>
+              <w:spacing w:after="40"/>
+            </w:pPr>
+            <w:r/>
+            <w:r>
+              <w:rPr>
+                <w:color w:val="1A1A1A"/>
+                <w:sz w:val="17"/>
+              </w:rPr>
+              <w:t>Activate an entry with Enter</w:t>
+            </w:r>
+          </w:p>
+        </w:tc>
+        <w:tc>
+          <w:tcPr>
+            <w:tcW w:type="dxa" w:w="2520"/>
+          </w:tcPr>
+          <w:p>
+            <w:pPr>
+              <w:spacing w:after="40"/>
+            </w:pPr>
+            <w:r/>
+            <w:r>
+              <w:rPr>
+                <w:color w:val="1A1A1A"/>
+                <w:sz w:val="17"/>
+              </w:rPr>
+              <w:t>Navigates to the reading</w:t>
+            </w:r>
+          </w:p>
+        </w:tc>
+        <w:tc>
+          <w:tcPr>
+            <w:tcW w:type="dxa" w:w="792"/>
+          </w:tcPr>
+          <w:p>
+            <w:pPr>
+              <w:spacing w:after="40"/>
+            </w:pPr>
+            <w:r/>
+            <w:r>
+              <w:rPr>
+                <w:color w:val="1A1A1A"/>
+                <w:sz w:val="17"/>
+              </w:rPr>
+              <w:t>PASS</w:t>
+            </w:r>
+          </w:p>
+        </w:tc>
+      </w:tr>
+      <w:tr>
+        <w:tc>
+          <w:tcPr>
+            <w:tcW w:type="dxa" w:w="576"/>
+          </w:tcPr>
+          <w:p>
+            <w:pPr>
+              <w:spacing w:after="40"/>
+            </w:pPr>
+            <w:r/>
+            <w:r>
+              <w:rPr>
+                <w:color w:val="1A1A1A"/>
+                <w:sz w:val="17"/>
+              </w:rPr>
+              <w:t>34</w:t>
+            </w:r>
+          </w:p>
+        </w:tc>
+        <w:tc>
+          <w:tcPr>
+            <w:tcW w:type="dxa" w:w="1944"/>
+          </w:tcPr>
+          <w:p>
+            <w:pPr>
+              <w:spacing w:after="40"/>
+            </w:pPr>
+            <w:r/>
+            <w:r>
+              <w:rPr>
+                <w:color w:val="1A1A1A"/>
+                <w:sz w:val="17"/>
+              </w:rPr>
+              <w:t>Console and assets</w:t>
+            </w:r>
+          </w:p>
+        </w:tc>
+        <w:tc>
+          <w:tcPr>
+            <w:tcW w:type="dxa" w:w="3456"/>
+          </w:tcPr>
+          <w:p>
+            <w:pPr>
+              <w:spacing w:after="40"/>
+            </w:pPr>
+            <w:r/>
+            <w:r>
+              <w:rPr>
+                <w:color w:val="1A1A1A"/>
+                <w:sz w:val="17"/>
+              </w:rPr>
+              <w:t>Console errors on audited routes</w:t>
+            </w:r>
+          </w:p>
+        </w:tc>
+        <w:tc>
+          <w:tcPr>
+            <w:tcW w:type="dxa" w:w="2520"/>
+          </w:tcPr>
+          <w:p>
+            <w:pPr>
+              <w:spacing w:after="40"/>
+            </w:pPr>
+            <w:r/>
+            <w:r>
+              <w:rPr>
+                <w:color w:val="1A1A1A"/>
+                <w:sz w:val="17"/>
+              </w:rPr>
+              <w:t>0</w:t>
+            </w:r>
+          </w:p>
+        </w:tc>
+        <w:tc>
+          <w:tcPr>
+            <w:tcW w:type="dxa" w:w="792"/>
+          </w:tcPr>
+          <w:p>
+            <w:pPr>
+              <w:spacing w:after="40"/>
+            </w:pPr>
+            <w:r/>
+            <w:r>
+              <w:rPr>
+                <w:color w:val="1A1A1A"/>
+                <w:sz w:val="17"/>
+              </w:rPr>
+              <w:t>PASS</w:t>
+            </w:r>
+          </w:p>
+        </w:tc>
+      </w:tr>
+      <w:tr>
+        <w:tc>
+          <w:tcPr>
+            <w:tcW w:type="dxa" w:w="576"/>
+          </w:tcPr>
+          <w:p>
+            <w:pPr>
+              <w:spacing w:after="40"/>
+            </w:pPr>
+            <w:r/>
+            <w:r>
+              <w:rPr>
+                <w:color w:val="1A1A1A"/>
+                <w:sz w:val="17"/>
+              </w:rPr>
+              <w:t>35</w:t>
             </w:r>
           </w:p>
         </w:tc>
@@ -9376,7 +10258,7 @@
           <w:color w:val="5A5A5A"/>
           <w:sz w:val="18"/>
         </w:rPr>
-        <w:t>Table 15 — 10 files, +109 / -23 lines</w:t>
+        <w:t>Table 15 — 11 source files. PR #10: 10 files, +109/-23. PR #11: 1 file, +12/-3.</w:t>
       </w:r>
     </w:p>
     <w:tbl>
@@ -9387,13 +10269,14 @@
         <w:tblLook w:firstColumn="1" w:firstRow="1" w:lastColumn="0" w:lastRow="0" w:noHBand="0" w:noVBand="1" w:val="04A0"/>
       </w:tblPr>
       <w:tblGrid>
-        <w:gridCol w:w="4824"/>
-        <w:gridCol w:w="4824"/>
+        <w:gridCol w:w="3216"/>
+        <w:gridCol w:w="3216"/>
+        <w:gridCol w:w="3216"/>
       </w:tblGrid>
       <w:tr>
         <w:tc>
           <w:tcPr>
-            <w:tcW w:type="dxa" w:w="5616"/>
+            <w:tcW w:type="dxa" w:w="5040"/>
             <w:shd w:val="clear" w:color="auto" w:fill="4A4A4A"/>
           </w:tcPr>
           <w:p>
@@ -9410,7 +10293,7 @@
         </w:tc>
         <w:tc>
           <w:tcPr>
-            <w:tcW w:type="dxa" w:w="3600"/>
+            <w:tcW w:type="dxa" w:w="2736"/>
             <w:shd w:val="clear" w:color="auto" w:fill="4A4A4A"/>
           </w:tcPr>
           <w:p>
@@ -9425,11 +10308,28 @@
             </w:r>
           </w:p>
         </w:tc>
+        <w:tc>
+          <w:tcPr>
+            <w:tcW w:type="dxa" w:w="1440"/>
+            <w:shd w:val="clear" w:color="auto" w:fill="4A4A4A"/>
+          </w:tcPr>
+          <w:p>
+            <w:r/>
+            <w:r>
+              <w:rPr>
+                <w:b/>
+                <w:color w:val="FFFFFF"/>
+                <w:sz w:val="17"/>
+              </w:rPr>
+              <w:t>PR</w:t>
+            </w:r>
+          </w:p>
+        </w:tc>
       </w:tr>
       <w:tr>
         <w:tc>
           <w:tcPr>
-            <w:tcW w:type="dxa" w:w="5616"/>
+            <w:tcW w:type="dxa" w:w="5040"/>
           </w:tcPr>
           <w:p>
             <w:pPr>
@@ -9447,7 +10347,7 @@
         </w:tc>
         <w:tc>
           <w:tcPr>
-            <w:tcW w:type="dxa" w:w="3600"/>
+            <w:tcW w:type="dxa" w:w="2736"/>
           </w:tcPr>
           <w:p>
             <w:pPr>
@@ -9460,6 +10360,24 @@
                 <w:sz w:val="17"/>
               </w:rPr>
               <w:t>DEF-004</w:t>
+            </w:r>
+          </w:p>
+        </w:tc>
+        <w:tc>
+          <w:tcPr>
+            <w:tcW w:type="dxa" w:w="1440"/>
+          </w:tcPr>
+          <w:p>
+            <w:pPr>
+              <w:spacing w:after="40"/>
+            </w:pPr>
+            <w:r/>
+            <w:r>
+              <w:rPr>
+                <w:color w:val="1A1A1A"/>
+                <w:sz w:val="17"/>
+              </w:rPr>
+              <w:t>#10</w:t>
             </w:r>
           </w:p>
         </w:tc>
@@ -9467,7 +10385,7 @@
       <w:tr>
         <w:tc>
           <w:tcPr>
-            <w:tcW w:type="dxa" w:w="5616"/>
+            <w:tcW w:type="dxa" w:w="5040"/>
           </w:tcPr>
           <w:p>
             <w:pPr>
@@ -9485,7 +10403,7 @@
         </w:tc>
         <w:tc>
           <w:tcPr>
-            <w:tcW w:type="dxa" w:w="3600"/>
+            <w:tcW w:type="dxa" w:w="2736"/>
           </w:tcPr>
           <w:p>
             <w:pPr>
@@ -9498,6 +10416,24 @@
                 <w:sz w:val="17"/>
               </w:rPr>
               <w:t>DEF-004</w:t>
+            </w:r>
+          </w:p>
+        </w:tc>
+        <w:tc>
+          <w:tcPr>
+            <w:tcW w:type="dxa" w:w="1440"/>
+          </w:tcPr>
+          <w:p>
+            <w:pPr>
+              <w:spacing w:after="40"/>
+            </w:pPr>
+            <w:r/>
+            <w:r>
+              <w:rPr>
+                <w:color w:val="1A1A1A"/>
+                <w:sz w:val="17"/>
+              </w:rPr>
+              <w:t>#10</w:t>
             </w:r>
           </w:p>
         </w:tc>
@@ -9505,7 +10441,7 @@
       <w:tr>
         <w:tc>
           <w:tcPr>
-            <w:tcW w:type="dxa" w:w="5616"/>
+            <w:tcW w:type="dxa" w:w="5040"/>
           </w:tcPr>
           <w:p>
             <w:pPr>
@@ -9523,7 +10459,7 @@
         </w:tc>
         <w:tc>
           <w:tcPr>
-            <w:tcW w:type="dxa" w:w="3600"/>
+            <w:tcW w:type="dxa" w:w="2736"/>
           </w:tcPr>
           <w:p>
             <w:pPr>
@@ -9536,6 +10472,24 @@
                 <w:sz w:val="17"/>
               </w:rPr>
               <w:t>DEF-004</w:t>
+            </w:r>
+          </w:p>
+        </w:tc>
+        <w:tc>
+          <w:tcPr>
+            <w:tcW w:type="dxa" w:w="1440"/>
+          </w:tcPr>
+          <w:p>
+            <w:pPr>
+              <w:spacing w:after="40"/>
+            </w:pPr>
+            <w:r/>
+            <w:r>
+              <w:rPr>
+                <w:color w:val="1A1A1A"/>
+                <w:sz w:val="17"/>
+              </w:rPr>
+              <w:t>#10</w:t>
             </w:r>
           </w:p>
         </w:tc>
@@ -9543,7 +10497,7 @@
       <w:tr>
         <w:tc>
           <w:tcPr>
-            <w:tcW w:type="dxa" w:w="5616"/>
+            <w:tcW w:type="dxa" w:w="5040"/>
           </w:tcPr>
           <w:p>
             <w:pPr>
@@ -9561,7 +10515,7 @@
         </w:tc>
         <w:tc>
           <w:tcPr>
-            <w:tcW w:type="dxa" w:w="3600"/>
+            <w:tcW w:type="dxa" w:w="2736"/>
           </w:tcPr>
           <w:p>
             <w:pPr>
@@ -9574,6 +10528,24 @@
                 <w:sz w:val="17"/>
               </w:rPr>
               <w:t>DEF-004</w:t>
+            </w:r>
+          </w:p>
+        </w:tc>
+        <w:tc>
+          <w:tcPr>
+            <w:tcW w:type="dxa" w:w="1440"/>
+          </w:tcPr>
+          <w:p>
+            <w:pPr>
+              <w:spacing w:after="40"/>
+            </w:pPr>
+            <w:r/>
+            <w:r>
+              <w:rPr>
+                <w:color w:val="1A1A1A"/>
+                <w:sz w:val="17"/>
+              </w:rPr>
+              <w:t>#10</w:t>
             </w:r>
           </w:p>
         </w:tc>
@@ -9581,7 +10553,7 @@
       <w:tr>
         <w:tc>
           <w:tcPr>
-            <w:tcW w:type="dxa" w:w="5616"/>
+            <w:tcW w:type="dxa" w:w="5040"/>
           </w:tcPr>
           <w:p>
             <w:pPr>
@@ -9599,7 +10571,7 @@
         </w:tc>
         <w:tc>
           <w:tcPr>
-            <w:tcW w:type="dxa" w:w="3600"/>
+            <w:tcW w:type="dxa" w:w="2736"/>
           </w:tcPr>
           <w:p>
             <w:pPr>
@@ -9612,6 +10584,24 @@
                 <w:sz w:val="17"/>
               </w:rPr>
               <w:t>DEF-005</w:t>
+            </w:r>
+          </w:p>
+        </w:tc>
+        <w:tc>
+          <w:tcPr>
+            <w:tcW w:type="dxa" w:w="1440"/>
+          </w:tcPr>
+          <w:p>
+            <w:pPr>
+              <w:spacing w:after="40"/>
+            </w:pPr>
+            <w:r/>
+            <w:r>
+              <w:rPr>
+                <w:color w:val="1A1A1A"/>
+                <w:sz w:val="17"/>
+              </w:rPr>
+              <w:t>#10</w:t>
             </w:r>
           </w:p>
         </w:tc>
@@ -9619,7 +10609,7 @@
       <w:tr>
         <w:tc>
           <w:tcPr>
-            <w:tcW w:type="dxa" w:w="5616"/>
+            <w:tcW w:type="dxa" w:w="5040"/>
           </w:tcPr>
           <w:p>
             <w:pPr>
@@ -9637,7 +10627,7 @@
         </w:tc>
         <w:tc>
           <w:tcPr>
-            <w:tcW w:type="dxa" w:w="3600"/>
+            <w:tcW w:type="dxa" w:w="2736"/>
           </w:tcPr>
           <w:p>
             <w:pPr>
@@ -9650,6 +10640,24 @@
                 <w:sz w:val="17"/>
               </w:rPr>
               <w:t>DEF-005, DEF-007</w:t>
+            </w:r>
+          </w:p>
+        </w:tc>
+        <w:tc>
+          <w:tcPr>
+            <w:tcW w:type="dxa" w:w="1440"/>
+          </w:tcPr>
+          <w:p>
+            <w:pPr>
+              <w:spacing w:after="40"/>
+            </w:pPr>
+            <w:r/>
+            <w:r>
+              <w:rPr>
+                <w:color w:val="1A1A1A"/>
+                <w:sz w:val="17"/>
+              </w:rPr>
+              <w:t>#10</w:t>
             </w:r>
           </w:p>
         </w:tc>
@@ -9657,7 +10665,7 @@
       <w:tr>
         <w:tc>
           <w:tcPr>
-            <w:tcW w:type="dxa" w:w="5616"/>
+            <w:tcW w:type="dxa" w:w="5040"/>
           </w:tcPr>
           <w:p>
             <w:pPr>
@@ -9675,7 +10683,7 @@
         </w:tc>
         <w:tc>
           <w:tcPr>
-            <w:tcW w:type="dxa" w:w="3600"/>
+            <w:tcW w:type="dxa" w:w="2736"/>
           </w:tcPr>
           <w:p>
             <w:pPr>
@@ -9688,6 +10696,24 @@
                 <w:sz w:val="17"/>
               </w:rPr>
               <w:t>DEF-006</w:t>
+            </w:r>
+          </w:p>
+        </w:tc>
+        <w:tc>
+          <w:tcPr>
+            <w:tcW w:type="dxa" w:w="1440"/>
+          </w:tcPr>
+          <w:p>
+            <w:pPr>
+              <w:spacing w:after="40"/>
+            </w:pPr>
+            <w:r/>
+            <w:r>
+              <w:rPr>
+                <w:color w:val="1A1A1A"/>
+                <w:sz w:val="17"/>
+              </w:rPr>
+              <w:t>#10</w:t>
             </w:r>
           </w:p>
         </w:tc>
@@ -9695,7 +10721,7 @@
       <w:tr>
         <w:tc>
           <w:tcPr>
-            <w:tcW w:type="dxa" w:w="5616"/>
+            <w:tcW w:type="dxa" w:w="5040"/>
           </w:tcPr>
           <w:p>
             <w:pPr>
@@ -9713,7 +10739,7 @@
         </w:tc>
         <w:tc>
           <w:tcPr>
-            <w:tcW w:type="dxa" w:w="3600"/>
+            <w:tcW w:type="dxa" w:w="2736"/>
           </w:tcPr>
           <w:p>
             <w:pPr>
@@ -9726,6 +10752,24 @@
                 <w:sz w:val="17"/>
               </w:rPr>
               <w:t>DEF-008</w:t>
+            </w:r>
+          </w:p>
+        </w:tc>
+        <w:tc>
+          <w:tcPr>
+            <w:tcW w:type="dxa" w:w="1440"/>
+          </w:tcPr>
+          <w:p>
+            <w:pPr>
+              <w:spacing w:after="40"/>
+            </w:pPr>
+            <w:r/>
+            <w:r>
+              <w:rPr>
+                <w:color w:val="1A1A1A"/>
+                <w:sz w:val="17"/>
+              </w:rPr>
+              <w:t>#10</w:t>
             </w:r>
           </w:p>
         </w:tc>
@@ -9733,7 +10777,7 @@
       <w:tr>
         <w:tc>
           <w:tcPr>
-            <w:tcW w:type="dxa" w:w="5616"/>
+            <w:tcW w:type="dxa" w:w="5040"/>
           </w:tcPr>
           <w:p>
             <w:pPr>
@@ -9751,7 +10795,7 @@
         </w:tc>
         <w:tc>
           <w:tcPr>
-            <w:tcW w:type="dxa" w:w="3600"/>
+            <w:tcW w:type="dxa" w:w="2736"/>
           </w:tcPr>
           <w:p>
             <w:pPr>
@@ -9764,6 +10808,24 @@
                 <w:sz w:val="17"/>
               </w:rPr>
               <w:t>DEF-008, DEF-009</w:t>
+            </w:r>
+          </w:p>
+        </w:tc>
+        <w:tc>
+          <w:tcPr>
+            <w:tcW w:type="dxa" w:w="1440"/>
+          </w:tcPr>
+          <w:p>
+            <w:pPr>
+              <w:spacing w:after="40"/>
+            </w:pPr>
+            <w:r/>
+            <w:r>
+              <w:rPr>
+                <w:color w:val="1A1A1A"/>
+                <w:sz w:val="17"/>
+              </w:rPr>
+              <w:t>#10</w:t>
             </w:r>
           </w:p>
         </w:tc>
@@ -9771,7 +10833,7 @@
       <w:tr>
         <w:tc>
           <w:tcPr>
-            <w:tcW w:type="dxa" w:w="5616"/>
+            <w:tcW w:type="dxa" w:w="5040"/>
           </w:tcPr>
           <w:p>
             <w:pPr>
@@ -9789,7 +10851,7 @@
         </w:tc>
         <w:tc>
           <w:tcPr>
-            <w:tcW w:type="dxa" w:w="3600"/>
+            <w:tcW w:type="dxa" w:w="2736"/>
           </w:tcPr>
           <w:p>
             <w:pPr>
@@ -9802,6 +10864,136 @@
                 <w:sz w:val="17"/>
               </w:rPr>
               <w:t>DEF-008</w:t>
+            </w:r>
+          </w:p>
+        </w:tc>
+        <w:tc>
+          <w:tcPr>
+            <w:tcW w:type="dxa" w:w="1440"/>
+          </w:tcPr>
+          <w:p>
+            <w:pPr>
+              <w:spacing w:after="40"/>
+            </w:pPr>
+            <w:r/>
+            <w:r>
+              <w:rPr>
+                <w:color w:val="1A1A1A"/>
+                <w:sz w:val="17"/>
+              </w:rPr>
+              <w:t>#10</w:t>
+            </w:r>
+          </w:p>
+        </w:tc>
+      </w:tr>
+      <w:tr>
+        <w:tc>
+          <w:tcPr>
+            <w:tcW w:type="dxa" w:w="5040"/>
+          </w:tcPr>
+          <w:p>
+            <w:pPr>
+              <w:spacing w:after="40"/>
+            </w:pPr>
+            <w:r/>
+            <w:r>
+              <w:rPr>
+                <w:color w:val="1A1A1A"/>
+                <w:sz w:val="17"/>
+              </w:rPr>
+              <w:t>app/readings/[type]/[id]/ReadingDetail.tsx</w:t>
+            </w:r>
+          </w:p>
+        </w:tc>
+        <w:tc>
+          <w:tcPr>
+            <w:tcW w:type="dxa" w:w="2736"/>
+          </w:tcPr>
+          <w:p>
+            <w:pPr>
+              <w:spacing w:after="40"/>
+            </w:pPr>
+            <w:r/>
+            <w:r>
+              <w:rPr>
+                <w:color w:val="1A1A1A"/>
+                <w:sz w:val="17"/>
+              </w:rPr>
+              <w:t>DEF-010, DEF-011</w:t>
+            </w:r>
+          </w:p>
+        </w:tc>
+        <w:tc>
+          <w:tcPr>
+            <w:tcW w:type="dxa" w:w="1440"/>
+          </w:tcPr>
+          <w:p>
+            <w:pPr>
+              <w:spacing w:after="40"/>
+            </w:pPr>
+            <w:r/>
+            <w:r>
+              <w:rPr>
+                <w:color w:val="1A1A1A"/>
+                <w:sz w:val="17"/>
+              </w:rPr>
+              <w:t>#11</w:t>
+            </w:r>
+          </w:p>
+        </w:tc>
+      </w:tr>
+      <w:tr>
+        <w:tc>
+          <w:tcPr>
+            <w:tcW w:type="dxa" w:w="5040"/>
+          </w:tcPr>
+          <w:p>
+            <w:pPr>
+              <w:spacing w:after="40"/>
+            </w:pPr>
+            <w:r/>
+            <w:r>
+              <w:rPr>
+                <w:color w:val="1A1A1A"/>
+                <w:sz w:val="17"/>
+              </w:rPr>
+              <w:t>docs/Velora_Tarot_Test_Report.docx</w:t>
+            </w:r>
+          </w:p>
+        </w:tc>
+        <w:tc>
+          <w:tcPr>
+            <w:tcW w:type="dxa" w:w="2736"/>
+          </w:tcPr>
+          <w:p>
+            <w:pPr>
+              <w:spacing w:after="40"/>
+            </w:pPr>
+            <w:r/>
+            <w:r>
+              <w:rPr>
+                <w:color w:val="1A1A1A"/>
+                <w:sz w:val="17"/>
+              </w:rPr>
+              <w:t>This report</w:t>
+            </w:r>
+          </w:p>
+        </w:tc>
+        <w:tc>
+          <w:tcPr>
+            <w:tcW w:type="dxa" w:w="1440"/>
+          </w:tcPr>
+          <w:p>
+            <w:pPr>
+              <w:spacing w:after="40"/>
+            </w:pPr>
+            <w:r/>
+            <w:r>
+              <w:rPr>
+                <w:color w:val="1A1A1A"/>
+                <w:sz w:val="17"/>
+              </w:rPr>
+              <w:t>#10</w:t>
             </w:r>
           </w:p>
         </w:tc>
@@ -9819,7 +11011,17 @@
           <w:color w:val="1A1A1A"/>
           <w:sz w:val="18"/>
         </w:rPr>
-        <w:t>Pull request: https://github.com/Katakuri2001/Tarot_Web_APP/pull/10</w:t>
+        <w:t>Pull requests: https://github.com/Katakuri2001/Tarot_Web_APP/pull/10 and /pull/11</w:t>
+      </w:r>
+    </w:p>
+    <w:p>
+      <w:r>
+        <w:rPr>
+          <w:i/>
+          <w:color w:val="5A5A5A"/>
+          <w:sz w:val="18"/>
+        </w:rPr>
+        <w:t>The two branches touch ReadingDetail.tsx in different regions and git merge-tree reports no conflicts between them.</w:t>
       </w:r>
     </w:p>
     <w:p>

</xml_diff>